<commit_message>
Add dashboard evidence and BERTweet workflow
Co-authored-by: Copilot <223556219+Copilot@users.noreply.github.com>
</commit_message>
<xml_diff>
--- a/I26043443_Dattu_Nayak_Paltya_Report.docx
+++ b/I26043443_Dattu_Nayak_Paltya_Report.docx
@@ -2200,7 +2200,7 @@
       <w:r>
         <w:drawing>
           <wp:inline xmlns:a="http://schemas.openxmlformats.org/drawingml/2006/main" xmlns:pic="http://schemas.openxmlformats.org/drawingml/2006/picture">
-            <wp:extent cx="2971800" cy="1263418"/>
+            <wp:extent cx="2971800" cy="1020487"/>
             <wp:docPr id="3" name="Picture 3"/>
             <wp:cNvGraphicFramePr>
               <a:graphicFrameLocks noChangeAspect="1"/>
@@ -2221,7 +2221,7 @@
                   <pic:spPr>
                     <a:xfrm>
                       <a:off x="0" y="0"/>
-                      <a:ext cx="2971800" cy="1263418"/>
+                      <a:ext cx="2971800" cy="1020487"/>
                     </a:xfrm>
                     <a:prstGeom prst="rect"/>
                   </pic:spPr>
@@ -5381,7 +5381,411 @@
           <w:color w:val="191919"/>
           <w:sz w:val="20"/>
         </w:rPr>
-        <w:t>C.2. Expected inputs and outputs</w:t>
+        <w:t>C.2. Web dashboard workflow screenshots</w:t>
+      </w:r>
+    </w:p>
+    <w:p>
+      <w:pPr>
+        <w:keepLines w:val="0"/>
+        <w:widowControl/>
+        <w:spacing w:after="60" w:line="240" w:lineRule="auto"/>
+        <w:jc w:val="both"/>
+      </w:pPr>
+      <w:r>
+        <w:rPr>
+          <w:rFonts w:ascii="Times New Roman" w:hAnsi="Times New Roman" w:eastAsia="Times New Roman"/>
+          <w:b w:val="0"/>
+          <w:i w:val="0"/>
+          <w:color w:val="191919"/>
+          <w:sz w:val="20"/>
+        </w:rPr>
+        <w:t>The following browser captures document the implemented dashboard workflow: reviewing the overview and benchmark summaries, inspecting evaluation results, and filtering labeled examples in the dataset explorer. The explorer capture shows the test split filtered to positive examples.</w:t>
+      </w:r>
+    </w:p>
+    <w:p>
+      <w:pPr>
+        <w:spacing w:before="60" w:after="0"/>
+        <w:jc w:val="center"/>
+      </w:pPr>
+      <w:r>
+        <w:drawing>
+          <wp:inline xmlns:a="http://schemas.openxmlformats.org/drawingml/2006/main" xmlns:pic="http://schemas.openxmlformats.org/drawingml/2006/picture">
+            <wp:extent cx="2971800" cy="2166938"/>
+            <wp:docPr id="7" name="Picture 7"/>
+            <wp:cNvGraphicFramePr>
+              <a:graphicFrameLocks noChangeAspect="1"/>
+            </wp:cNvGraphicFramePr>
+            <a:graphic>
+              <a:graphicData uri="http://schemas.openxmlformats.org/drawingml/2006/picture">
+                <pic:pic>
+                  <pic:nvPicPr>
+                    <pic:cNvPr id="0" name="workflow-dashboard-overview.png"/>
+                    <pic:cNvPicPr/>
+                  </pic:nvPicPr>
+                  <pic:blipFill>
+                    <a:blip r:embed="rId16"/>
+                    <a:stretch>
+                      <a:fillRect/>
+                    </a:stretch>
+                  </pic:blipFill>
+                  <pic:spPr>
+                    <a:xfrm>
+                      <a:off x="0" y="0"/>
+                      <a:ext cx="2971800" cy="2166938"/>
+                    </a:xfrm>
+                    <a:prstGeom prst="rect"/>
+                  </pic:spPr>
+                </pic:pic>
+              </a:graphicData>
+            </a:graphic>
+          </wp:inline>
+        </w:drawing>
+      </w:r>
+    </w:p>
+    <w:p>
+      <w:pPr>
+        <w:spacing w:after="100"/>
+        <w:jc w:val="center"/>
+      </w:pPr>
+      <w:r>
+        <w:rPr>
+          <w:rFonts w:ascii="Times New Roman" w:hAnsi="Times New Roman" w:eastAsia="Times New Roman"/>
+          <w:b w:val="0"/>
+          <w:i w:val="0"/>
+          <w:color w:val="191919"/>
+          <w:sz w:val="16"/>
+        </w:rPr>
+        <w:t>Fig. C.1. Dashboard overview with benchmark summaries and model comparisons.</w:t>
+      </w:r>
+    </w:p>
+    <w:p>
+      <w:pPr>
+        <w:spacing w:before="60" w:after="0"/>
+        <w:jc w:val="center"/>
+      </w:pPr>
+      <w:r>
+        <w:drawing>
+          <wp:inline xmlns:a="http://schemas.openxmlformats.org/drawingml/2006/main" xmlns:pic="http://schemas.openxmlformats.org/drawingml/2006/picture">
+            <wp:extent cx="2971800" cy="1146266"/>
+            <wp:docPr id="8" name="Picture 8"/>
+            <wp:cNvGraphicFramePr>
+              <a:graphicFrameLocks noChangeAspect="1"/>
+            </wp:cNvGraphicFramePr>
+            <a:graphic>
+              <a:graphicData uri="http://schemas.openxmlformats.org/drawingml/2006/picture">
+                <pic:pic>
+                  <pic:nvPicPr>
+                    <pic:cNvPr id="0" name="workflow-model-evaluation.png"/>
+                    <pic:cNvPicPr/>
+                  </pic:nvPicPr>
+                  <pic:blipFill>
+                    <a:blip r:embed="rId17"/>
+                    <a:stretch>
+                      <a:fillRect/>
+                    </a:stretch>
+                  </pic:blipFill>
+                  <pic:spPr>
+                    <a:xfrm>
+                      <a:off x="0" y="0"/>
+                      <a:ext cx="2971800" cy="1146266"/>
+                    </a:xfrm>
+                    <a:prstGeom prst="rect"/>
+                  </pic:spPr>
+                </pic:pic>
+              </a:graphicData>
+            </a:graphic>
+          </wp:inline>
+        </w:drawing>
+      </w:r>
+    </w:p>
+    <w:p>
+      <w:pPr>
+        <w:spacing w:after="100"/>
+        <w:jc w:val="center"/>
+      </w:pPr>
+      <w:r>
+        <w:rPr>
+          <w:rFonts w:ascii="Times New Roman" w:hAnsi="Times New Roman" w:eastAsia="Times New Roman"/>
+          <w:b w:val="0"/>
+          <w:i w:val="0"/>
+          <w:color w:val="191919"/>
+          <w:sz w:val="16"/>
+        </w:rPr>
+        <w:t>Fig. C.2. Cross-validation summary and selected-model test confusion matrix.</w:t>
+      </w:r>
+    </w:p>
+    <w:p>
+      <w:pPr>
+        <w:spacing w:before="60" w:after="0"/>
+        <w:jc w:val="center"/>
+      </w:pPr>
+      <w:r>
+        <w:drawing>
+          <wp:inline xmlns:a="http://schemas.openxmlformats.org/drawingml/2006/main" xmlns:pic="http://schemas.openxmlformats.org/drawingml/2006/picture">
+            <wp:extent cx="2971800" cy="1876665"/>
+            <wp:docPr id="9" name="Picture 9"/>
+            <wp:cNvGraphicFramePr>
+              <a:graphicFrameLocks noChangeAspect="1"/>
+            </wp:cNvGraphicFramePr>
+            <a:graphic>
+              <a:graphicData uri="http://schemas.openxmlformats.org/drawingml/2006/picture">
+                <pic:pic>
+                  <pic:nvPicPr>
+                    <pic:cNvPr id="0" name="workflow-dataset-explorer.png"/>
+                    <pic:cNvPicPr/>
+                  </pic:nvPicPr>
+                  <pic:blipFill>
+                    <a:blip r:embed="rId18"/>
+                    <a:stretch>
+                      <a:fillRect/>
+                    </a:stretch>
+                  </pic:blipFill>
+                  <pic:spPr>
+                    <a:xfrm>
+                      <a:off x="0" y="0"/>
+                      <a:ext cx="2971800" cy="1876665"/>
+                    </a:xfrm>
+                    <a:prstGeom prst="rect"/>
+                  </pic:spPr>
+                </pic:pic>
+              </a:graphicData>
+            </a:graphic>
+          </wp:inline>
+        </w:drawing>
+      </w:r>
+    </w:p>
+    <w:p>
+      <w:pPr>
+        <w:spacing w:after="100"/>
+        <w:jc w:val="center"/>
+      </w:pPr>
+      <w:r>
+        <w:rPr>
+          <w:rFonts w:ascii="Times New Roman" w:hAnsi="Times New Roman" w:eastAsia="Times New Roman"/>
+          <w:b w:val="0"/>
+          <w:i w:val="0"/>
+          <w:color w:val="191919"/>
+          <w:sz w:val="16"/>
+        </w:rPr>
+        <w:t>Fig. C.3. Test-set examples filtered to the positive sentiment label.</w:t>
+      </w:r>
+    </w:p>
+    <w:p>
+      <w:pPr>
+        <w:keepNext/>
+        <w:spacing w:before="60" w:after="40"/>
+      </w:pPr>
+      <w:r>
+        <w:rPr>
+          <w:rFonts w:ascii="Times New Roman" w:hAnsi="Times New Roman" w:eastAsia="Times New Roman"/>
+          <w:b/>
+          <w:i/>
+          <w:color w:val="191919"/>
+          <w:sz w:val="20"/>
+        </w:rPr>
+        <w:t>C.3. Manual prediction test-case screenshots</w:t>
+      </w:r>
+    </w:p>
+    <w:p>
+      <w:pPr>
+        <w:keepLines w:val="0"/>
+        <w:widowControl/>
+        <w:spacing w:after="60" w:line="240" w:lineRule="auto"/>
+        <w:jc w:val="both"/>
+      </w:pPr>
+      <w:r>
+        <w:rPr>
+          <w:rFonts w:ascii="Times New Roman" w:hAnsi="Times New Roman" w:eastAsia="Times New Roman"/>
+          <w:b w:val="0"/>
+          <w:i w:val="0"/>
+          <w:color w:val="191919"/>
+          <w:sz w:val="20"/>
+        </w:rPr>
+        <w:t>Each browser capture shows the supplied text and the label returned by the running web interface. These illustrative smoke tests verify the interaction path only; they are not a substitute for held-out test-set evaluation.</w:t>
+      </w:r>
+    </w:p>
+    <w:p>
+      <w:pPr>
+        <w:spacing w:before="60" w:after="0"/>
+        <w:jc w:val="center"/>
+      </w:pPr>
+      <w:r>
+        <w:drawing>
+          <wp:inline xmlns:a="http://schemas.openxmlformats.org/drawingml/2006/main" xmlns:pic="http://schemas.openxmlformats.org/drawingml/2006/picture">
+            <wp:extent cx="2971800" cy="2224471"/>
+            <wp:docPr id="10" name="Picture 10"/>
+            <wp:cNvGraphicFramePr>
+              <a:graphicFrameLocks noChangeAspect="1"/>
+            </wp:cNvGraphicFramePr>
+            <a:graphic>
+              <a:graphicData uri="http://schemas.openxmlformats.org/drawingml/2006/picture">
+                <pic:pic>
+                  <pic:nvPicPr>
+                    <pic:cNvPr id="0" name="test-case-positive.png"/>
+                    <pic:cNvPicPr/>
+                  </pic:nvPicPr>
+                  <pic:blipFill>
+                    <a:blip r:embed="rId19"/>
+                    <a:stretch>
+                      <a:fillRect/>
+                    </a:stretch>
+                  </pic:blipFill>
+                  <pic:spPr>
+                    <a:xfrm>
+                      <a:off x="0" y="0"/>
+                      <a:ext cx="2971800" cy="2224471"/>
+                    </a:xfrm>
+                    <a:prstGeom prst="rect"/>
+                  </pic:spPr>
+                </pic:pic>
+              </a:graphicData>
+            </a:graphic>
+          </wp:inline>
+        </w:drawing>
+      </w:r>
+    </w:p>
+    <w:p>
+      <w:pPr>
+        <w:spacing w:after="100"/>
+        <w:jc w:val="center"/>
+      </w:pPr>
+      <w:r>
+        <w:rPr>
+          <w:rFonts w:ascii="Times New Roman" w:hAnsi="Times New Roman" w:eastAsia="Times New Roman"/>
+          <w:b w:val="0"/>
+          <w:i w:val="0"/>
+          <w:color w:val="191919"/>
+          <w:sz w:val="16"/>
+        </w:rPr>
+        <w:t>Fig. C.4. Test case 1: “I absolutely love this, it made my day!” returns positive.</w:t>
+      </w:r>
+    </w:p>
+    <w:p>
+      <w:pPr>
+        <w:spacing w:before="60" w:after="0"/>
+        <w:jc w:val="center"/>
+      </w:pPr>
+      <w:r>
+        <w:drawing>
+          <wp:inline xmlns:a="http://schemas.openxmlformats.org/drawingml/2006/main" xmlns:pic="http://schemas.openxmlformats.org/drawingml/2006/picture">
+            <wp:extent cx="2971800" cy="2224471"/>
+            <wp:docPr id="11" name="Picture 11"/>
+            <wp:cNvGraphicFramePr>
+              <a:graphicFrameLocks noChangeAspect="1"/>
+            </wp:cNvGraphicFramePr>
+            <a:graphic>
+              <a:graphicData uri="http://schemas.openxmlformats.org/drawingml/2006/picture">
+                <pic:pic>
+                  <pic:nvPicPr>
+                    <pic:cNvPr id="0" name="test-case-neutral.png"/>
+                    <pic:cNvPicPr/>
+                  </pic:nvPicPr>
+                  <pic:blipFill>
+                    <a:blip r:embed="rId20"/>
+                    <a:stretch>
+                      <a:fillRect/>
+                    </a:stretch>
+                  </pic:blipFill>
+                  <pic:spPr>
+                    <a:xfrm>
+                      <a:off x="0" y="0"/>
+                      <a:ext cx="2971800" cy="2224471"/>
+                    </a:xfrm>
+                    <a:prstGeom prst="rect"/>
+                  </pic:spPr>
+                </pic:pic>
+              </a:graphicData>
+            </a:graphic>
+          </wp:inline>
+        </w:drawing>
+      </w:r>
+    </w:p>
+    <w:p>
+      <w:pPr>
+        <w:spacing w:after="100"/>
+        <w:jc w:val="center"/>
+      </w:pPr>
+      <w:r>
+        <w:rPr>
+          <w:rFonts w:ascii="Times New Roman" w:hAnsi="Times New Roman" w:eastAsia="Times New Roman"/>
+          <w:b w:val="0"/>
+          <w:i w:val="0"/>
+          <w:color w:val="191919"/>
+          <w:sz w:val="16"/>
+        </w:rPr>
+        <w:t>Fig. C.5. Test case 2: “The product is okay, nothing special.” returns neutral.</w:t>
+      </w:r>
+    </w:p>
+    <w:p>
+      <w:pPr>
+        <w:spacing w:before="60" w:after="0"/>
+        <w:jc w:val="center"/>
+      </w:pPr>
+      <w:r>
+        <w:drawing>
+          <wp:inline xmlns:a="http://schemas.openxmlformats.org/drawingml/2006/main" xmlns:pic="http://schemas.openxmlformats.org/drawingml/2006/picture">
+            <wp:extent cx="2971800" cy="2224471"/>
+            <wp:docPr id="12" name="Picture 12"/>
+            <wp:cNvGraphicFramePr>
+              <a:graphicFrameLocks noChangeAspect="1"/>
+            </wp:cNvGraphicFramePr>
+            <a:graphic>
+              <a:graphicData uri="http://schemas.openxmlformats.org/drawingml/2006/picture">
+                <pic:pic>
+                  <pic:nvPicPr>
+                    <pic:cNvPr id="0" name="test-case-negative.png"/>
+                    <pic:cNvPicPr/>
+                  </pic:nvPicPr>
+                  <pic:blipFill>
+                    <a:blip r:embed="rId21"/>
+                    <a:stretch>
+                      <a:fillRect/>
+                    </a:stretch>
+                  </pic:blipFill>
+                  <pic:spPr>
+                    <a:xfrm>
+                      <a:off x="0" y="0"/>
+                      <a:ext cx="2971800" cy="2224471"/>
+                    </a:xfrm>
+                    <a:prstGeom prst="rect"/>
+                  </pic:spPr>
+                </pic:pic>
+              </a:graphicData>
+            </a:graphic>
+          </wp:inline>
+        </w:drawing>
+      </w:r>
+    </w:p>
+    <w:p>
+      <w:pPr>
+        <w:spacing w:after="100"/>
+        <w:jc w:val="center"/>
+      </w:pPr>
+      <w:r>
+        <w:rPr>
+          <w:rFonts w:ascii="Times New Roman" w:hAnsi="Times New Roman" w:eastAsia="Times New Roman"/>
+          <w:b w:val="0"/>
+          <w:i w:val="0"/>
+          <w:color w:val="191919"/>
+          <w:sz w:val="16"/>
+        </w:rPr>
+        <w:t>Fig. C.6. Test case 3: “Terrible service, I am very disappointed.” returns negative.</w:t>
+      </w:r>
+    </w:p>
+    <w:p>
+      <w:pPr>
+        <w:keepNext/>
+        <w:spacing w:before="60" w:after="40"/>
+      </w:pPr>
+      <w:r>
+        <w:rPr>
+          <w:rFonts w:ascii="Times New Roman" w:hAnsi="Times New Roman" w:eastAsia="Times New Roman"/>
+          <w:b/>
+          <w:i/>
+          <w:color w:val="191919"/>
+          <w:sz w:val="20"/>
+        </w:rPr>
+        <w:t>C.4. Expected inputs and outputs</w:t>
       </w:r>
     </w:p>
     <w:p>
@@ -5451,7 +5855,7 @@
           <w:color w:val="191919"/>
           <w:sz w:val="20"/>
         </w:rPr>
-        <w:t>C.3. Operational limitations and failure handling</w:t>
+        <w:t>C.5. Operational limitations and failure handling</w:t>
       </w:r>
     </w:p>
     <w:p>

</xml_diff>